<commit_message>
docs: update English field spec to keep Japanese UI labels as-is
https://claude.ai/code/session_01TnthfERnfJwArEZg6AWGob
</commit_message>
<xml_diff>
--- a/Master_Management_Field_Specification.docx
+++ b/Master_Management_Field_Specification.docx
@@ -148,9 +148,9 @@
               <w:rPr>
                 <w:sz w:val="17"/>
               </w:rPr>
-              <w:t>Manufacturer Name</w:t>
+              <w:t>メーカー名</w:t>
               <w:br/>
-              <w:t>(メーカー名)</w:t>
+              <w:t>(Manufacturer Name)</w:t>
             </w:r>
           </w:p>
         </w:tc>
@@ -165,7 +165,7 @@
               <w:rPr>
                 <w:sz w:val="17"/>
               </w:rPr>
-              <w:t>Manages the list of manufacturers registered in the system. Items are added via a text input + "Add" button, and removed via the × button.</w:t>
+              <w:t>Manages the list of manufacturers registered in the system. Items are added via a text input + "追加" button, and removed via the × button.</w:t>
             </w:r>
           </w:p>
         </w:tc>
@@ -199,9 +199,9 @@
               <w:rPr>
                 <w:sz w:val="17"/>
               </w:rPr>
-              <w:t>Manufacturer Name (auto-filled)</w:t>
+              <w:t>メーカー名 (auto-filled)</w:t>
               <w:br/>
-              <w:t>Location: Sheet Info &gt; Creation Info</w:t>
+              <w:t>Location: シート基本情報 &gt; 作成情報</w:t>
             </w:r>
           </w:p>
         </w:tc>
@@ -233,9 +233,9 @@
               <w:rPr>
                 <w:sz w:val="17"/>
               </w:rPr>
-              <w:t>Retailer Name</w:t>
+              <w:t>小売店名</w:t>
               <w:br/>
-              <w:t>(小売店名)</w:t>
+              <w:t>(Retailer Name)</w:t>
             </w:r>
           </w:p>
         </w:tc>
@@ -250,7 +250,7 @@
               <w:rPr>
                 <w:sz w:val="17"/>
               </w:rPr>
-              <w:t>Manages the list of retail partner names. Items are added via a text input + "Add" button, and removed via the × button.</w:t>
+              <w:t>Manages the list of retail partner names. Items are added via a text input + "追加" button, and removed via the × button.</w:t>
             </w:r>
           </w:p>
         </w:tc>
@@ -284,9 +284,9 @@
               <w:rPr>
                 <w:sz w:val="17"/>
               </w:rPr>
-              <w:t>Submission Destination (提出先)</w:t>
+              <w:t>提出先</w:t>
               <w:br/>
-              <w:t>Location: Sheet Info &gt; Details</w:t>
+              <w:t>Location: シート基本情報 &gt; 詳細情報</w:t>
             </w:r>
           </w:p>
         </w:tc>
@@ -301,7 +301,7 @@
               <w:rPr>
                 <w:sz w:val="17"/>
               </w:rPr>
-              <w:t>Appears as the dropdown options for "Submission Destination". Also serves as the candidate pool when adding Projects in per-manufacturer settings.</w:t>
+              <w:t>Appears as the dropdown options for "提出先". Also serves as the candidate pool when adding 案件 in per-manufacturer settings.</w:t>
             </w:r>
           </w:p>
         </w:tc>
@@ -318,9 +318,9 @@
               <w:rPr>
                 <w:sz w:val="17"/>
               </w:rPr>
-              <w:t>Risk Classification</w:t>
+              <w:t>リスク分類</w:t>
               <w:br/>
-              <w:t>(リスク分類)</w:t>
+              <w:t>(Risk Classification)</w:t>
             </w:r>
           </w:p>
         </w:tc>
@@ -335,7 +335,7 @@
               <w:rPr>
                 <w:sz w:val="17"/>
               </w:rPr>
-              <w:t>Manages the dropdown options for product risk classification. Items are added via a text input + "Add" button, and removed via the × button.</w:t>
+              <w:t>Manages the dropdown options for product risk classification. Items are added via a text input + "追加" button, and removed via the × button.</w:t>
             </w:r>
           </w:p>
         </w:tc>
@@ -369,9 +369,9 @@
               <w:rPr>
                 <w:sz w:val="17"/>
               </w:rPr>
-              <w:t>Risk Classification</w:t>
+              <w:t>リスク分類</w:t>
               <w:br/>
-              <w:t>Location: Product Info section (per product)</w:t>
+              <w:t>Location: 商品情報 section (per product)</w:t>
             </w:r>
           </w:p>
         </w:tc>
@@ -386,7 +386,7 @@
               <w:rPr>
                 <w:sz w:val="17"/>
               </w:rPr>
-              <w:t>Appears as dropdown options in each product row's "Risk Classification" field. The first item in the list is auto-selected when a new product is added.</w:t>
+              <w:t>Appears as dropdown options in each product row's "リスク分類" field. The first item in the list is auto-selected when a new product is added.</w:t>
             </w:r>
           </w:p>
         </w:tc>
@@ -403,9 +403,9 @@
               <w:rPr>
                 <w:sz w:val="17"/>
               </w:rPr>
-              <w:t>Specific Ingredient</w:t>
+              <w:t>特定成分</w:t>
               <w:br/>
-              <w:t>(特定成分)</w:t>
+              <w:t>(Specific Ingredient)</w:t>
             </w:r>
           </w:p>
         </w:tc>
@@ -420,7 +420,7 @@
               <w:rPr>
                 <w:sz w:val="17"/>
               </w:rPr>
-              <w:t>Manages the checkbox options for specific ingredients contained in products. Items are added via a text input + "Add" button, and removed via the × button.</w:t>
+              <w:t>Manages the checkbox options for specific ingredients contained in products. Items are added via a text input + "追加" button, and removed via the × button.</w:t>
             </w:r>
           </w:p>
         </w:tc>
@@ -454,9 +454,9 @@
               <w:rPr>
                 <w:sz w:val="17"/>
               </w:rPr>
-              <w:t>Specific Ingredients</w:t>
+              <w:t>特定成分</w:t>
               <w:br/>
-              <w:t>Location: Product Info section (per product)</w:t>
+              <w:t>Location: 商品情報 section (per product)</w:t>
             </w:r>
           </w:p>
         </w:tc>
@@ -471,7 +471,7 @@
               <w:rPr>
                 <w:sz w:val="17"/>
               </w:rPr>
-              <w:t>Appears as multi-select checkbox options in each product row's "Specific Ingredients" field. Multiple items can be checked.</w:t>
+              <w:t>Appears as multi-select checkbox options in each product row's "特定成分" field. Multiple items can be checked.</w:t>
             </w:r>
           </w:p>
         </w:tc>
@@ -495,7 +495,7 @@
           <w:color w:val="555555"/>
           <w:sz w:val="18"/>
         </w:rPr>
-        <w:t>* Select the target manufacturer from the dropdown at the top of the section before editing.</w:t>
+        <w:t>* Select the target manufacturer from the dropdown at the top of the "メーカー別設定" section before editing.</w:t>
       </w:r>
     </w:p>
     <w:tbl>
@@ -620,9 +620,9 @@
               <w:rPr>
                 <w:sz w:val="17"/>
               </w:rPr>
-              <w:t>Category Name</w:t>
+              <w:t>カテゴリ名</w:t>
               <w:br/>
-              <w:t>(カテゴリ名)</w:t>
+              <w:t>(Category Name)</w:t>
             </w:r>
           </w:p>
         </w:tc>
@@ -637,7 +637,7 @@
               <w:rPr>
                 <w:sz w:val="17"/>
               </w:rPr>
-              <w:t>Manages the shelf/category name options per manufacturer. Items are added via a text input + "Add" button, and removed via the × button.</w:t>
+              <w:t>Manages the shelf/category name options per manufacturer. Items are added via a text input + "追加" button, and removed via the × button.</w:t>
             </w:r>
           </w:p>
         </w:tc>
@@ -671,9 +671,9 @@
               <w:rPr>
                 <w:sz w:val="17"/>
               </w:rPr>
-              <w:t>Category Name (required)</w:t>
+              <w:t>カテゴリ名 (required)</w:t>
               <w:br/>
-              <w:t>Location: Sheet Info &gt; Details</w:t>
+              <w:t>Location: シート基本情報 &gt; 詳細情報</w:t>
             </w:r>
           </w:p>
         </w:tc>
@@ -688,7 +688,7 @@
               <w:rPr>
                 <w:sz w:val="17"/>
               </w:rPr>
-              <w:t>Appears as dropdown options for "Category Name", filtered to the logged-in manufacturer only. The selected value is also used in the auto-generated sheet title.</w:t>
+              <w:t>Appears as dropdown options for "カテゴリ名", filtered to the logged-in manufacturer only. The selected value is also used in the auto-generated sheet title.</w:t>
             </w:r>
           </w:p>
         </w:tc>
@@ -705,9 +705,9 @@
               <w:rPr>
                 <w:sz w:val="17"/>
               </w:rPr>
-              <w:t>Face Settings</w:t>
+              <w:t>フェイス設定</w:t>
               <w:br/>
-              <w:t>(フェイス設定)</w:t>
+              <w:t>(Face Settings)</w:t>
             </w:r>
           </w:p>
         </w:tc>
@@ -722,7 +722,7 @@
               <w:rPr>
                 <w:sz w:val="17"/>
               </w:rPr>
-              <w:t>Manages shelf width labels paired with a maximum width (mm). Added via a label text input + MAX value number input + "Add" button; removed via the × button.</w:t>
+              <w:t>Manages shelf width labels paired with a maximum width (mm). Added via a label text input + MAX value number input + "追加" button; removed via the × button.</w:t>
             </w:r>
           </w:p>
         </w:tc>
@@ -754,11 +754,11 @@
               <w:rPr>
                 <w:sz w:val="17"/>
               </w:rPr>
-              <w:t>Shelf Width (棚割り幅)</w:t>
+              <w:t>棚割り幅</w:t>
               <w:br/>
-              <w:t>Shelf Width Total — auto-calculated</w:t>
+              <w:t>棚割り幅合計 (auto-calculated)</w:t>
               <w:br/>
-              <w:t>Location: Sheet Info &gt; Details</w:t>
+              <w:t>Location: シート基本情報 &gt; 詳細情報</w:t>
             </w:r>
           </w:p>
         </w:tc>
@@ -773,7 +773,7 @@
               <w:rPr>
                 <w:sz w:val="17"/>
               </w:rPr>
-              <w:t>Appears as dropdown options for "Shelf Width". Once selected, its MAX value is used as the upper limit. If the sum of (product width × facing count) across all products exceeds the MAX, an error is shown and "Entry Complete" is blocked. Auto-selected if only one option is configured.</w:t>
+              <w:t>Appears as dropdown options for "棚割り幅". Once selected, its MAX value is used as the upper limit. If the sum of (product width × facing count) exceeds the MAX, an error is shown and "エントリー完了" is blocked. Auto-selected if only one option is configured.</w:t>
             </w:r>
           </w:p>
         </w:tc>
@@ -790,13 +790,9 @@
               <w:rPr>
                 <w:sz w:val="17"/>
               </w:rPr>
-              <w:t>Default Deployment</w:t>
+              <w:t>デフォルト展開スタート月</w:t>
               <w:br/>
-              <w:t>Start Month</w:t>
-              <w:br/>
-              <w:t>(デフォルト展開</w:t>
-              <w:br/>
-              <w:t>スタート月)</w:t>
+              <w:t>(Default Deployment Start Month)</w:t>
             </w:r>
           </w:p>
         </w:tc>
@@ -811,7 +807,7 @@
               <w:rPr>
                 <w:sz w:val="17"/>
               </w:rPr>
-              <w:t>Sets which month(s) should be pre-selected as the deployment start month when creating a new entry sheet. Toggle ON/OFF by clicking each month button (1–12). Multiple months can be selected.</w:t>
+              <w:t>Sets which month(s) should be pre-selected as 展開スタート月 when creating a new entry sheet. Toggle ON/OFF by clicking each month button (1月–12月). Multiple months can be selected.</w:t>
             </w:r>
           </w:p>
         </w:tc>
@@ -826,7 +822,7 @@
               <w:rPr>
                 <w:sz w:val="17"/>
               </w:rPr>
-              <w:t>• Toggle buttons for months 1–12</w:t>
+              <w:t>• Toggle buttons for 1月–12月</w:t>
               <w:br/>
               <w:t>• Multiple selection allowed</w:t>
             </w:r>
@@ -843,11 +839,11 @@
               <w:rPr>
                 <w:sz w:val="17"/>
               </w:rPr>
-              <w:t>Deployment Start Month</w:t>
+              <w:t>展開スタート月</w:t>
               <w:br/>
-              <w:t>Deployment Period</w:t>
+              <w:t>展開期間</w:t>
               <w:br/>
-              <w:t>Location: Sheet Info &gt; Details</w:t>
+              <w:t>Location: シート基本情報 &gt; 詳細情報</w:t>
             </w:r>
           </w:p>
         </w:tc>
@@ -862,7 +858,7 @@
               <w:rPr>
                 <w:sz w:val="17"/>
               </w:rPr>
-              <w:t>On new sheet creation, if exactly one configured month falls within the next 4 months from today, it is auto-selected. The deployment end month is automatically calculated as the month following the start month.</w:t>
+              <w:t>On new sheet creation, if exactly one configured month falls within the next 4 months from today, it is auto-selected. 展開終了月 is automatically calculated as the month following 展開スタート月.</w:t>
             </w:r>
           </w:p>
         </w:tc>
@@ -879,9 +875,9 @@
               <w:rPr>
                 <w:sz w:val="17"/>
               </w:rPr>
-              <w:t>Projects</w:t>
+              <w:t>案件</w:t>
               <w:br/>
-              <w:t>(案件)</w:t>
+              <w:t>(Project)</w:t>
             </w:r>
           </w:p>
         </w:tc>
@@ -896,7 +892,7 @@
               <w:rPr>
                 <w:sz w:val="17"/>
               </w:rPr>
-              <w:t>Associates project names with a manufacturer by selecting from the "Retailer Name" dropdown. Removed via the × button.</w:t>
+              <w:t>Associates project names with a manufacturer by selecting from the "小売店名" dropdown. Removed via the × button.</w:t>
             </w:r>
           </w:p>
         </w:tc>
@@ -911,7 +907,7 @@
               <w:rPr>
                 <w:sz w:val="17"/>
               </w:rPr>
-              <w:t>• Selection only from existing Retailer Names (dropdown)</w:t>
+              <w:t>• Selection only from existing 小売店名 (dropdown)</w:t>
               <w:br/>
               <w:t>• No duplicates</w:t>
             </w:r>
@@ -928,9 +924,9 @@
               <w:rPr>
                 <w:sz w:val="17"/>
               </w:rPr>
-              <w:t>Project (案件)</w:t>
+              <w:t>案件</w:t>
               <w:br/>
-              <w:t>Location: Sheet Info &gt; Details</w:t>
+              <w:t>Location: シート基本情報 &gt; 詳細情報</w:t>
             </w:r>
           </w:p>
         </w:tc>
@@ -945,7 +941,7 @@
               <w:rPr>
                 <w:sz w:val="17"/>
               </w:rPr>
-              <w:t>The "Project" dropdown is shown on the entry sheet only if the manufacturer has at least one project configured. Only projects linked to that manufacturer are listed.</w:t>
+              <w:t>The "案件" dropdown is shown on the entry sheet only if the manufacturer has at least one project configured. Only projects linked to that manufacturer are listed.</w:t>
             </w:r>
           </w:p>
         </w:tc>
@@ -968,7 +964,7 @@
         <w:rPr>
           <w:sz w:val="18"/>
         </w:rPr>
-        <w:t>When "Deployment Start Month", "Submission Destination", or "Category Name" is entered or changed, the sheet title is automatically generated in the following format.</w:t>
+        <w:t>When "展開スタート月", "提出先", or "カテゴリ名" is entered or changed, the sheet title is automatically generated in the following format.</w:t>
         <w:br/>
         <w:t>(Manually edited titles are not overwritten.)</w:t>
       </w:r>
@@ -979,7 +975,7 @@
           <w:rFonts w:ascii="Courier New" w:hAnsi="Courier New"/>
           <w:sz w:val="20"/>
         </w:rPr>
-        <w:t xml:space="preserve">    YYYY/MM   &lt;Submission Destination&gt;   &lt;Category Name&gt;   "Enter Brand Name"</w:t>
+        <w:t xml:space="preserve">    YYYY年M月　&lt;提出先&gt;　&lt;カテゴリ名&gt;　"ブランド名を記入"</w:t>
       </w:r>
     </w:p>
     <w:sectPr>

</xml_diff>